<commit_message>
Update projekat na v1.1
</commit_message>
<xml_diff>
--- a/Sklopi.me.docx
+++ b/Sklopi.me.docx
@@ -628,6 +628,7 @@
               <w:rPr>
                 <w:rtl w:val="0"/>
               </w:rPr>
+              <w:t xml:space="preserve">16.04.2026.</w:t>
             </w:r>
           </w:p>
         </w:tc>
@@ -665,6 +666,7 @@
               <w:rPr>
                 <w:rtl w:val="0"/>
               </w:rPr>
+              <w:t xml:space="preserve">1.1</w:t>
             </w:r>
           </w:p>
         </w:tc>
@@ -702,6 +704,7 @@
               <w:rPr>
                 <w:rtl w:val="0"/>
               </w:rPr>
+              <w:t xml:space="preserve">Manje izmene nakon dizajniranja prototipa</w:t>
             </w:r>
           </w:p>
         </w:tc>
@@ -739,6 +742,7 @@
               <w:rPr>
                 <w:rtl w:val="0"/>
               </w:rPr>
+              <w:t xml:space="preserve">Aleksandar Rašković</w:t>
             </w:r>
           </w:p>
         </w:tc>
@@ -773,7 +777,7 @@
     </w:p>
     <w:sdt>
       <w:sdtPr>
-        <w:id w:val="1230691460"/>
+        <w:id w:val="-1964594837"/>
         <w:docPartObj>
           <w:docPartGallery w:val="Table of Contents"/>
           <w:docPartUnique w:val="1"/>
@@ -3897,7 +3901,7 @@
         <w:rPr>
           <w:rtl w:val="0"/>
         </w:rPr>
-        <w:t xml:space="preserve">Ukoliko korisnik nema svoj nalog, može da se registruje unošenjem korisničkog imena i lozinke. Nakon provere da je korisničko ime jedinstveno, podaci se upisuju u bazu podataka i korisnik sme da se prijavi na sistem.</w:t>
+        <w:t xml:space="preserve">Ukoliko korisnik nema svoj nalog, može da se registruje unošenjem e-maila, korisničkog imena i lozinke. Nakon provere da je e-mail jedinstven, podaci se upisuju u bazu podataka i korisnik sme da se prijavi na sistem.</w:t>
       </w:r>
     </w:p>
     <w:p>
@@ -3928,7 +3932,7 @@
         <w:rPr>
           <w:rtl w:val="0"/>
         </w:rPr>
-        <w:t xml:space="preserve">Registrovani korisnik se autorizuje unošenjem korisničkog imena i lozinke. Nakon uspešne autorizacije korisnik se nalazi na glavnoj strani sajta i ima pristup funkcionalnostima datim u sekciji 3.2.</w:t>
+        <w:t xml:space="preserve">Registrovani korisnik se autorizuje unošenjem e-maila i lozinke. Nakon uspešne autorizacije korisnik se nalazi na glavnoj strani sajta i ima pristup funkcionalnostima datim u sekciji 3.2.</w:t>
       </w:r>
     </w:p>
     <w:p>
@@ -4092,7 +4096,7 @@
         <w:rPr>
           <w:rtl w:val="0"/>
         </w:rPr>
-        <w:t xml:space="preserve">Registrovanom korisniku se klikom na dugme “kupi” na dnu liste izabranih komponenti konfiguracije, svaka u zasebnom tabu, otvaraju web stranice prodavnica kod kojih je najniža cena date komponente.</w:t>
+        <w:t xml:space="preserve">Registrovanom korisniku se klikom na dugme “kupi” na dnu liste izabranih komponenti konfiguracije, svaka u zasebnom tabu, otvaraju web stranice prodavnica kod kojih je najniža cena date komponente. Kupovina pojedinačne komponente je moguća sa stranice komponente.</w:t>
       </w:r>
     </w:p>
     <w:p>
@@ -4168,7 +4172,7 @@
         <w:rPr>
           <w:rtl w:val="0"/>
         </w:rPr>
-        <w:t xml:space="preserve">Korisnik (i gost) može da pretražuje gotove računare drugih korisnika, filtrira rezultate po traženoj komponenti ili rezultatu benchmark-a. Klikom na jedan od rezultata otvara se posebna stranica sa svim slikama i detaljnim informacijama koje je kreator računara stavio na objavu.</w:t>
+        <w:t xml:space="preserve">Korisnik (i gost) može da pretražuje gotove računare drugih korisnika, pretražuje rezultate po traženoj komponenti ili rezultatu benchmark-a. Klikom na jedan od rezultata otvara se posebna stranica sa svim slikama i detaljnim informacijama koje je kreator računara stavio na objavu.</w:t>
       </w:r>
     </w:p>
     <w:p>

</xml_diff>